<commit_message>
Add A3 poster and update PBL report with final project details
- Add print-ready A3 poster (300 DPI JPEG/PNG) built from poster_a3.html,
  following the Poster.jpeg template and templates/prompt.txt
- Update the PBL report with team names, register numbers, guide,
  acknowledgements, PEOs/POs/PSOs and requirements from the final report PDF
- Replace the old report templates with the final report PDF and poster prompt

Co-Authored-By: Claude Opus 5.5 <noreply@anthropic.com>
</commit_message>
<xml_diff>
--- a/submission/PBL_Report_Java_AI_Interview_Simulator.docx
+++ b/submission/PBL_Report_Java_AI_Interview_Simulator.docx
@@ -14,7 +14,7 @@
           <w:i w:val="0"/>
           <w:sz w:val="40"/>
         </w:rPr>
-        <w:t>JAVA AI INTERVIEW SIMULATOR</w:t>
+        <w:t xml:space="preserve">AN INTERACTIVE JAVA TECHNICAL REVIEW SIMULATOR</w:t>
       </w:r>
     </w:p>
     <w:p>
@@ -72,7 +72,7 @@
           <w:i w:val="0"/>
           <w:sz w:val="26"/>
         </w:rPr>
-        <w:t>RITHILA (Reg. No. REG2026CS001)</w:t>
+        <w:t xml:space="preserve">RITHIKA S (2104251040779)</w:t>
       </w:r>
     </w:p>
     <w:p>
@@ -87,7 +87,7 @@
           <w:i w:val="0"/>
           <w:sz w:val="26"/>
         </w:rPr>
-        <w:t>REKHA (Reg. No. REG2026CS002)</w:t>
+        <w:t xml:space="preserve">SHWETHAA JV (2104251050318)</w:t>
       </w:r>
     </w:p>
     <w:p>
@@ -222,7 +222,7 @@
           <w:i w:val="0"/>
           <w:sz w:val="24"/>
         </w:rPr>
-        <w:t>October 2026</w:t>
+        <w:t xml:space="preserve">October - 2026</w:t>
       </w:r>
     </w:p>
     <w:p>
@@ -292,7 +292,7 @@
           <w:rFonts w:ascii="Times New Roman" w:hAnsi="Times New Roman"/>
           <w:sz w:val="24"/>
         </w:rPr>
-        <w:t>IM1. To create next generation leaders through effective teaching-learning methodologies and instil a scientific temperament to meet global challenges.</w:t>
+        <w:t xml:space="preserve">IM1. To create next generation leaders through effective teaching-learning methodologies and instil a scientific temper in them to meet global challenges.</w:t>
       </w:r>
     </w:p>
     <w:p>
@@ -328,7 +328,19 @@
           <w:rFonts w:ascii="Times New Roman" w:hAnsi="Times New Roman"/>
           <w:sz w:val="24"/>
         </w:rPr>
-        <w:t>IM4. To contribute towards the research ecosystem by providing a suitable environment.</w:t>
+        <w:t xml:space="preserve">IM4. To contribute towards the research ecosystem by providing a suitable, effective platform for interaction between industry, academia and R&amp;D establishments.</w:t>
+      </w:r>
+    </w:p>
+    <w:p>
+      <w:pPr>
+        <w:pStyle w:val="ListBullet"/>
+      </w:pPr>
+      <w:r>
+        <w:rPr>
+          <w:rFonts w:ascii="Times New Roman" w:hAnsi="Times New Roman"/>
+          <w:sz w:val="24"/>
+        </w:rPr>
+        <w:t xml:space="preserve">IM5. To nurture incubation centres enabling structured entrepreneurship and start-ups.</w:t>
       </w:r>
     </w:p>
     <w:p>
@@ -346,6 +358,7 @@
     <w:p>
       <w:pPr>
         <w:spacing w:after="120" w:before="0"/>
+        <w:jc w:val="both"/>
       </w:pPr>
       <w:r>
         <w:rPr>
@@ -354,7 +367,7 @@
           <w:i w:val="0"/>
           <w:sz w:val="24"/>
         </w:rPr>
-        <w:t>To excel in the emerging areas of Computer Science and Engineering by imparting knowledge, relevant practices and inculcating human values to transform students into potential resources who contribute innovatively through advanced computing.</w:t>
+        <w:t xml:space="preserve">To excel in the emerging areas of Computer Science and Engineering by imparting knowledge, relevant practices and inculcating human values to transform the students as potential resources to contribute innovatively through advanced computing in real time situations.</w:t>
       </w:r>
     </w:p>
     <w:p>
@@ -390,7 +403,7 @@
           <w:rFonts w:ascii="Times New Roman" w:hAnsi="Times New Roman"/>
           <w:sz w:val="24"/>
         </w:rPr>
-        <w:t>DM2. To transform the lives of students by nurturing ethical values, creativity and novelty to become entrepreneurs.</w:t>
+        <w:t xml:space="preserve">DM2. To transform the lives of the students by nurturing ethical values, creativity and novelty to become entrepreneurs and establish start-ups.</w:t>
       </w:r>
     </w:p>
     <w:p>
@@ -402,7 +415,456 @@
           <w:rFonts w:ascii="Times New Roman" w:hAnsi="Times New Roman"/>
           <w:sz w:val="24"/>
         </w:rPr>
-        <w:t>DM3. To habituate students to focus on sustainable solutions that improve quality of life and societal welfare.</w:t>
+        <w:t xml:space="preserve">DM3. To habituate the students to focus on sustainable solutions to improve the quality of life and the welfare of the society.</w:t>
+      </w:r>
+    </w:p>
+    <w:p>
+      <w:pPr>
+        <w:pStyle w:val="ListBullet"/>
+      </w:pPr>
+      <w:r>
+        <w:rPr>
+          <w:rFonts w:ascii="Times New Roman" w:hAnsi="Times New Roman"/>
+          <w:sz w:val="24"/>
+        </w:rPr>
+        <w:t xml:space="preserve">DM4. To enhance the fabric of research in computing through collaborative linkages with industry and academia.</w:t>
+      </w:r>
+    </w:p>
+    <w:p>
+      <w:pPr>
+        <w:pStyle w:val="ListBullet"/>
+      </w:pPr>
+      <w:r>
+        <w:rPr>
+          <w:rFonts w:ascii="Times New Roman" w:hAnsi="Times New Roman"/>
+          <w:sz w:val="24"/>
+        </w:rPr>
+        <w:t xml:space="preserve">DM5. To inculcate learning of the emerging technologies to pursue higher studies leading to lifelong learning.</w:t>
+      </w:r>
+    </w:p>
+    <w:p>
+      <w:r>
+        <w:br w:type="page"/>
+      </w:r>
+    </w:p>
+    <w:p>
+      <w:pPr>
+        <w:pStyle w:val="Heading2"/>
+      </w:pPr>
+      <w:r>
+        <w:rPr>
+          <w:rFonts w:ascii="Times New Roman" w:hAnsi="Times New Roman"/>
+          <w:color w:val="000000"/>
+        </w:rPr>
+        <w:t xml:space="preserve">PROGRAM EDUCATIONAL OBJECTIVES (PEOs)</w:t>
+      </w:r>
+    </w:p>
+    <w:p>
+      <w:pPr>
+        <w:spacing w:after="120" w:before="0"/>
+        <w:jc w:val="both"/>
+      </w:pPr>
+      <w:r>
+        <w:rPr>
+          <w:rFonts w:ascii="Times New Roman" w:hAnsi="Times New Roman"/>
+          <w:b/>
+          <w:i w:val="0"/>
+          <w:sz w:val="24"/>
+        </w:rPr>
+        <w:t xml:space="preserve">PEO 1: </w:t>
+      </w:r>
+      <w:r>
+        <w:rPr>
+          <w:rFonts w:ascii="Times New Roman" w:hAnsi="Times New Roman"/>
+          <w:b w:val="0"/>
+          <w:i w:val="0"/>
+          <w:sz w:val="24"/>
+        </w:rPr>
+        <w:t xml:space="preserve">Contribute to the industry as an Engineer through sound knowledge acquired in core engineering to develop new processes and implement the solutions for industrial problems.</w:t>
+      </w:r>
+    </w:p>
+    <w:p>
+      <w:pPr>
+        <w:spacing w:after="120" w:before="0"/>
+        <w:jc w:val="both"/>
+      </w:pPr>
+      <w:r>
+        <w:rPr>
+          <w:rFonts w:ascii="Times New Roman" w:hAnsi="Times New Roman"/>
+          <w:b/>
+          <w:i w:val="0"/>
+          <w:sz w:val="24"/>
+        </w:rPr>
+        <w:t xml:space="preserve">PEO 2: </w:t>
+      </w:r>
+      <w:r>
+        <w:rPr>
+          <w:rFonts w:ascii="Times New Roman" w:hAnsi="Times New Roman"/>
+          <w:b w:val="0"/>
+          <w:i w:val="0"/>
+          <w:sz w:val="24"/>
+        </w:rPr>
+        <w:t xml:space="preserve">Establish an organization / industry as an Entrepreneur with professionalism, leadership quality, teamwork, and ethical values to meet the societal needs.</w:t>
+      </w:r>
+    </w:p>
+    <w:p>
+      <w:pPr>
+        <w:spacing w:after="120" w:before="0"/>
+        <w:jc w:val="both"/>
+      </w:pPr>
+      <w:r>
+        <w:rPr>
+          <w:rFonts w:ascii="Times New Roman" w:hAnsi="Times New Roman"/>
+          <w:b/>
+          <w:i w:val="0"/>
+          <w:sz w:val="24"/>
+        </w:rPr>
+        <w:t xml:space="preserve">PEO 3: </w:t>
+      </w:r>
+      <w:r>
+        <w:rPr>
+          <w:rFonts w:ascii="Times New Roman" w:hAnsi="Times New Roman"/>
+          <w:b w:val="0"/>
+          <w:i w:val="0"/>
+          <w:sz w:val="24"/>
+        </w:rPr>
+        <w:t xml:space="preserve">Create a better future by pursuing higher education / research and develop the sustainable products / solutions to meet the demand.</w:t>
+      </w:r>
+    </w:p>
+    <w:p>
+      <w:pPr>
+        <w:pStyle w:val="Heading2"/>
+      </w:pPr>
+      <w:r>
+        <w:rPr>
+          <w:rFonts w:ascii="Times New Roman" w:hAnsi="Times New Roman"/>
+          <w:color w:val="000000"/>
+        </w:rPr>
+        <w:t xml:space="preserve">PROGRAM OUTCOMES (POs)</w:t>
+      </w:r>
+    </w:p>
+    <w:p>
+      <w:pPr>
+        <w:spacing w:after="120" w:before="0"/>
+        <w:jc w:val="both"/>
+      </w:pPr>
+      <w:r>
+        <w:rPr>
+          <w:rFonts w:ascii="Times New Roman" w:hAnsi="Times New Roman"/>
+          <w:b/>
+          <w:i w:val="0"/>
+          <w:sz w:val="24"/>
+        </w:rPr>
+        <w:t xml:space="preserve">PO1: Engineering Knowledge: </w:t>
+      </w:r>
+      <w:r>
+        <w:rPr>
+          <w:rFonts w:ascii="Times New Roman" w:hAnsi="Times New Roman"/>
+          <w:b w:val="0"/>
+          <w:i w:val="0"/>
+          <w:sz w:val="24"/>
+        </w:rPr>
+        <w:t xml:space="preserve">Apply knowledge of mathematics, natural science, computing, engineering fundamentals and an engineering specialization to develop to the solution of complex engineering problems.</w:t>
+      </w:r>
+    </w:p>
+    <w:p>
+      <w:pPr>
+        <w:spacing w:after="120" w:before="0"/>
+        <w:jc w:val="both"/>
+      </w:pPr>
+      <w:r>
+        <w:rPr>
+          <w:rFonts w:ascii="Times New Roman" w:hAnsi="Times New Roman"/>
+          <w:b/>
+          <w:i w:val="0"/>
+          <w:sz w:val="24"/>
+        </w:rPr>
+        <w:t xml:space="preserve">PO2: Problem Analysis: </w:t>
+      </w:r>
+      <w:r>
+        <w:rPr>
+          <w:rFonts w:ascii="Times New Roman" w:hAnsi="Times New Roman"/>
+          <w:b w:val="0"/>
+          <w:i w:val="0"/>
+          <w:sz w:val="24"/>
+        </w:rPr>
+        <w:t xml:space="preserve">Identify, formulate, review research literature and analyze complex engineering problems reaching substantiated conclusions with consideration for sustainable development.</w:t>
+      </w:r>
+    </w:p>
+    <w:p>
+      <w:pPr>
+        <w:spacing w:after="120" w:before="0"/>
+        <w:jc w:val="both"/>
+      </w:pPr>
+      <w:r>
+        <w:rPr>
+          <w:rFonts w:ascii="Times New Roman" w:hAnsi="Times New Roman"/>
+          <w:b/>
+          <w:i w:val="0"/>
+          <w:sz w:val="24"/>
+        </w:rPr>
+        <w:t xml:space="preserve">PO3: Design/Development of Solutions: </w:t>
+      </w:r>
+      <w:r>
+        <w:rPr>
+          <w:rFonts w:ascii="Times New Roman" w:hAnsi="Times New Roman"/>
+          <w:b w:val="0"/>
+          <w:i w:val="0"/>
+          <w:sz w:val="24"/>
+        </w:rPr>
+        <w:t xml:space="preserve">Design creative solutions for complex engineering problems and design/develop systems/components/processes to meet identified needs with consideration for the public health and safety, whole-life cost, net zero carbon, culture, society and environment as required.</w:t>
+      </w:r>
+    </w:p>
+    <w:p>
+      <w:pPr>
+        <w:spacing w:after="120" w:before="0"/>
+        <w:jc w:val="both"/>
+      </w:pPr>
+      <w:r>
+        <w:rPr>
+          <w:rFonts w:ascii="Times New Roman" w:hAnsi="Times New Roman"/>
+          <w:b/>
+          <w:i w:val="0"/>
+          <w:sz w:val="24"/>
+        </w:rPr>
+        <w:t xml:space="preserve">PO4: Conduct Investigations of Complex Problems: </w:t>
+      </w:r>
+      <w:r>
+        <w:rPr>
+          <w:rFonts w:ascii="Times New Roman" w:hAnsi="Times New Roman"/>
+          <w:b w:val="0"/>
+          <w:i w:val="0"/>
+          <w:sz w:val="24"/>
+        </w:rPr>
+        <w:t xml:space="preserve">Conduct investigations of complex engineering problems using research-based knowledge including design of experiments, modelling, analysis &amp; interpretation of data to provide valid conclusions.</w:t>
+      </w:r>
+    </w:p>
+    <w:p>
+      <w:pPr>
+        <w:spacing w:after="120" w:before="0"/>
+        <w:jc w:val="both"/>
+      </w:pPr>
+      <w:r>
+        <w:rPr>
+          <w:rFonts w:ascii="Times New Roman" w:hAnsi="Times New Roman"/>
+          <w:b/>
+          <w:i w:val="0"/>
+          <w:sz w:val="24"/>
+        </w:rPr>
+        <w:t xml:space="preserve">PO5: Engineering Tool Usage: </w:t>
+      </w:r>
+      <w:r>
+        <w:rPr>
+          <w:rFonts w:ascii="Times New Roman" w:hAnsi="Times New Roman"/>
+          <w:b w:val="0"/>
+          <w:i w:val="0"/>
+          <w:sz w:val="24"/>
+        </w:rPr>
+        <w:t xml:space="preserve">Create, select and apply appropriate techniques, resources and modern engineering &amp; IT tools, including prediction and modelling recognizing their limitations to solve complex engineering problems.</w:t>
+      </w:r>
+    </w:p>
+    <w:p>
+      <w:pPr>
+        <w:spacing w:after="120" w:before="0"/>
+        <w:jc w:val="both"/>
+      </w:pPr>
+      <w:r>
+        <w:rPr>
+          <w:rFonts w:ascii="Times New Roman" w:hAnsi="Times New Roman"/>
+          <w:b/>
+          <w:i w:val="0"/>
+          <w:sz w:val="24"/>
+        </w:rPr>
+        <w:t xml:space="preserve">PO6: The Engineer and The World: </w:t>
+      </w:r>
+      <w:r>
+        <w:rPr>
+          <w:rFonts w:ascii="Times New Roman" w:hAnsi="Times New Roman"/>
+          <w:b w:val="0"/>
+          <w:i w:val="0"/>
+          <w:sz w:val="24"/>
+        </w:rPr>
+        <w:t xml:space="preserve">Analyze and evaluate societal and environmental aspects while solving complex engineering problems for its impact on sustainability with reference to economy, health, safety, legal framework, culture and environment.</w:t>
+      </w:r>
+    </w:p>
+    <w:p>
+      <w:pPr>
+        <w:spacing w:after="120" w:before="0"/>
+        <w:jc w:val="both"/>
+      </w:pPr>
+      <w:r>
+        <w:rPr>
+          <w:rFonts w:ascii="Times New Roman" w:hAnsi="Times New Roman"/>
+          <w:b/>
+          <w:i w:val="0"/>
+          <w:sz w:val="24"/>
+        </w:rPr>
+        <w:t xml:space="preserve">PO7: Ethics: </w:t>
+      </w:r>
+      <w:r>
+        <w:rPr>
+          <w:rFonts w:ascii="Times New Roman" w:hAnsi="Times New Roman"/>
+          <w:b w:val="0"/>
+          <w:i w:val="0"/>
+          <w:sz w:val="24"/>
+        </w:rPr>
+        <w:t xml:space="preserve">Apply ethical principles and commit to professional ethics, human values, diversity and inclusion; adhere to national &amp; international laws.</w:t>
+      </w:r>
+    </w:p>
+    <w:p>
+      <w:pPr>
+        <w:spacing w:after="120" w:before="0"/>
+        <w:jc w:val="both"/>
+      </w:pPr>
+      <w:r>
+        <w:rPr>
+          <w:rFonts w:ascii="Times New Roman" w:hAnsi="Times New Roman"/>
+          <w:b/>
+          <w:i w:val="0"/>
+          <w:sz w:val="24"/>
+        </w:rPr>
+        <w:t xml:space="preserve">PO8: Individual and Collaborative Team work: </w:t>
+      </w:r>
+      <w:r>
+        <w:rPr>
+          <w:rFonts w:ascii="Times New Roman" w:hAnsi="Times New Roman"/>
+          <w:b w:val="0"/>
+          <w:i w:val="0"/>
+          <w:sz w:val="24"/>
+        </w:rPr>
+        <w:t xml:space="preserve">Function effectively as an individual, and as a member or leader in diverse/multi-disciplinary teams.</w:t>
+      </w:r>
+    </w:p>
+    <w:p>
+      <w:pPr>
+        <w:spacing w:after="120" w:before="0"/>
+        <w:jc w:val="both"/>
+      </w:pPr>
+      <w:r>
+        <w:rPr>
+          <w:rFonts w:ascii="Times New Roman" w:hAnsi="Times New Roman"/>
+          <w:b/>
+          <w:i w:val="0"/>
+          <w:sz w:val="24"/>
+        </w:rPr>
+        <w:t xml:space="preserve">PO9: Communication: </w:t>
+      </w:r>
+      <w:r>
+        <w:rPr>
+          <w:rFonts w:ascii="Times New Roman" w:hAnsi="Times New Roman"/>
+          <w:b w:val="0"/>
+          <w:i w:val="0"/>
+          <w:sz w:val="24"/>
+        </w:rPr>
+        <w:t xml:space="preserve">Communicate effectively and inclusively within the engineering community and society at large, such as being able to comprehend and write effective reports and design documentation, make effective presentations considering cultural, language, and learning differences.</w:t>
+      </w:r>
+    </w:p>
+    <w:p>
+      <w:pPr>
+        <w:spacing w:after="120" w:before="0"/>
+        <w:jc w:val="both"/>
+      </w:pPr>
+      <w:r>
+        <w:rPr>
+          <w:rFonts w:ascii="Times New Roman" w:hAnsi="Times New Roman"/>
+          <w:b/>
+          <w:i w:val="0"/>
+          <w:sz w:val="24"/>
+        </w:rPr>
+        <w:t xml:space="preserve">PO10: Project Management and Finance: </w:t>
+      </w:r>
+      <w:r>
+        <w:rPr>
+          <w:rFonts w:ascii="Times New Roman" w:hAnsi="Times New Roman"/>
+          <w:b w:val="0"/>
+          <w:i w:val="0"/>
+          <w:sz w:val="24"/>
+        </w:rPr>
+        <w:t xml:space="preserve">Apply knowledge and understanding of engineering management principles and economic decision-making and apply these to one's own work, as a member and leader in a team, and to manage projects and in multidisciplinary environments.</w:t>
+      </w:r>
+    </w:p>
+    <w:p>
+      <w:pPr>
+        <w:spacing w:after="120" w:before="0"/>
+        <w:jc w:val="both"/>
+      </w:pPr>
+      <w:r>
+        <w:rPr>
+          <w:rFonts w:ascii="Times New Roman" w:hAnsi="Times New Roman"/>
+          <w:b/>
+          <w:i w:val="0"/>
+          <w:sz w:val="24"/>
+        </w:rPr>
+        <w:t xml:space="preserve">PO11: Life-Long Learning: </w:t>
+      </w:r>
+      <w:r>
+        <w:rPr>
+          <w:rFonts w:ascii="Times New Roman" w:hAnsi="Times New Roman"/>
+          <w:b w:val="0"/>
+          <w:i w:val="0"/>
+          <w:sz w:val="24"/>
+        </w:rPr>
+        <w:t xml:space="preserve">Recognize the need for, and have the preparation and ability for i) independent and life-long learning ii) adaptability to new and emerging technologies and iii) critical thinking in the broadest context of technological change.</w:t>
+      </w:r>
+    </w:p>
+    <w:p>
+      <w:pPr>
+        <w:pStyle w:val="Heading2"/>
+      </w:pPr>
+      <w:r>
+        <w:rPr>
+          <w:rFonts w:ascii="Times New Roman" w:hAnsi="Times New Roman"/>
+          <w:color w:val="000000"/>
+        </w:rPr>
+        <w:t xml:space="preserve">PROGRAM SPECIFIC OUTCOMES (PSOs)</w:t>
+      </w:r>
+    </w:p>
+    <w:p>
+      <w:pPr>
+        <w:spacing w:after="120" w:before="0"/>
+        <w:jc w:val="both"/>
+      </w:pPr>
+      <w:r>
+        <w:rPr>
+          <w:rFonts w:ascii="Times New Roman" w:hAnsi="Times New Roman"/>
+          <w:b/>
+          <w:i w:val="0"/>
+          <w:sz w:val="24"/>
+        </w:rPr>
+        <w:t xml:space="preserve">PSO 1: </w:t>
+      </w:r>
+      <w:r>
+        <w:rPr>
+          <w:rFonts w:ascii="Times New Roman" w:hAnsi="Times New Roman"/>
+          <w:b w:val="0"/>
+          <w:i w:val="0"/>
+          <w:sz w:val="24"/>
+        </w:rPr>
+        <w:t xml:space="preserve">Analyze, design and develop solutions in the areas of Business Process Management to build the quality products for industry and social needs.</w:t>
+      </w:r>
+    </w:p>
+    <w:p>
+      <w:pPr>
+        <w:spacing w:after="120" w:before="0"/>
+        <w:jc w:val="both"/>
+      </w:pPr>
+      <w:r>
+        <w:rPr>
+          <w:rFonts w:ascii="Times New Roman" w:hAnsi="Times New Roman"/>
+          <w:b/>
+          <w:i w:val="0"/>
+          <w:sz w:val="24"/>
+        </w:rPr>
+        <w:t xml:space="preserve">PSO 2: </w:t>
+      </w:r>
+      <w:r>
+        <w:rPr>
+          <w:rFonts w:ascii="Times New Roman" w:hAnsi="Times New Roman"/>
+          <w:b w:val="0"/>
+          <w:i w:val="0"/>
+          <w:sz w:val="24"/>
+        </w:rPr>
+        <w:t xml:space="preserve">Innovate ideas and solutions for real time problems in the field of Software Engineering and Mobile applications by adapting the emerging technologies and tools.</w:t>
       </w:r>
     </w:p>
     <w:p>
@@ -433,7 +895,7 @@
           <w:i w:val="0"/>
           <w:sz w:val="24"/>
         </w:rPr>
-        <w:t>This is to certify that the Project-Based Learning report titled “Java AI Interview Simulator” is a bonafide record of work carried out by RITHILA (Reg. No. REG2026CS001) and REKHA (Reg. No. REG2026CS002) of the Department of Computer Science and Engineering, Chennai Institute of Technology, as part of the continuous, mentor-guided Project-Based Learning (PBL) component of the Java Programming course during the academic year 2026-2027, under my supervision.</w:t>
+        <w:t>This is to certify that the Project-Based Learning report titled “AN INTERACTIVE JAVA TECHNICAL REVIEW SIMULATOR” is a bonafide record of work carried out by RITHIKA S (2104251040779) and SHWETHAA JV (2104251050318) of the Department of Computer Science and Engineering, Chennai Institute of Technology, as part of the continuous, mentor-guided Project-Based Learning (PBL) component of the Java Programming course during the academic year 2026-2027, under my supervision.</w:t>
       </w:r>
     </w:p>
     <w:p>
@@ -522,6 +984,14 @@
               <w:t>Dr. S. Pavithra M.E., Ph.D.</w:t>
               <w:br/>
               <w:t>HEAD OF THE DEPARTMENT</w:t>
+              <w:br/>
+              <w:t>Professor and Head,</w:t>
+              <w:br/>
+              <w:t>Department of Computer Science and Engineering</w:t>
+              <w:br/>
+              <w:t>Chennai Institute of Technology</w:t>
+              <w:br/>
+              <w:t>Chennai - 69</w:t>
             </w:r>
           </w:p>
         </w:tc>
@@ -536,9 +1006,17 @@
                 <w:rFonts w:ascii="Times New Roman" w:hAnsi="Times New Roman"/>
                 <w:sz w:val="22"/>
               </w:rPr>
-              <w:t>[Guide Name]</w:t>
+              <w:t>Dr. R. Kavitha M.E., Ph.D.</w:t>
               <w:br/>
-              <w:t>SUPERVISOR / [Designation]</w:t>
+              <w:t>SUPERVISOR</w:t>
+              <w:br/>
+              <w:t>Associate Professor</w:t>
+              <w:br/>
+              <w:t>Department of Computer Science and Engineering</w:t>
+              <w:br/>
+              <w:t>Chennai Institute of Technology</w:t>
+              <w:br/>
+              <w:t>Chennai - 69</w:t>
             </w:r>
           </w:p>
         </w:tc>
@@ -574,17 +1052,21 @@
     </w:p>
     <w:p>
       <w:pPr>
+        <w:tabs>
+          <w:tab w:val="right" w:pos="8640"/>
+        </w:tabs>
         <w:spacing w:after="120" w:before="0"/>
-        <w:jc w:val="right"/>
       </w:pPr>
       <w:r>
         <w:rPr>
           <w:rFonts w:ascii="Times New Roman" w:hAnsi="Times New Roman"/>
-          <w:b w:val="0"/>
+          <w:b/>
           <w:i w:val="0"/>
           <w:sz w:val="24"/>
         </w:rPr>
-        <w:t>INTERNAL EXAMINER</w:t>
+        <w:t xml:space="preserve">INTERNAL EXAMINER</w:t>
+        <w:tab/>
+        <w:t xml:space="preserve">EXTERNAL EXAMINER</w:t>
       </w:r>
     </w:p>
     <w:p>
@@ -615,7 +1097,7 @@
           <w:i w:val="0"/>
           <w:sz w:val="24"/>
         </w:rPr>
-        <w:t>We jointly declare that the PBL report on “Java AI Interview Simulator” is the result of original work done by us and, to the best of our knowledge, similar work has not been submitted to Anna University, Chennai for the requirement of the Degree of Bachelor of Engineering. This PBL report is submitted in partial fulfilment of the requirement for the award of the Degree of Computer Science and Engineering.</w:t>
+        <w:t>We jointly declare that the PBL report on “AN INTERACTIVE JAVA TECHNICAL REVIEW SIMULATOR” is the result of original work done by us and, to the best of our knowledge, similar work has not been submitted to Anna University, Chennai for the requirement of the Degree of Bachelor of Engineering. This PBL report is submitted in partial fulfilment of the requirement for the award of the Degree of Computer Science and Engineering.</w:t>
       </w:r>
     </w:p>
     <w:p>
@@ -643,7 +1125,7 @@
           <w:i w:val="0"/>
           <w:sz w:val="24"/>
         </w:rPr>
-        <w:t>RITHILA</w:t>
+        <w:t xml:space="preserve">RITHIKA S</w:t>
       </w:r>
     </w:p>
     <w:p>
@@ -658,7 +1140,7 @@
           <w:i w:val="0"/>
           <w:sz w:val="24"/>
         </w:rPr>
-        <w:t>REKHA</w:t>
+        <w:t xml:space="preserve">SHWETHAA JV</w:t>
       </w:r>
     </w:p>
     <w:p>
@@ -709,6 +1191,7 @@
     <w:p>
       <w:pPr>
         <w:spacing w:after="120" w:before="0"/>
+        <w:jc w:val="both"/>
       </w:pPr>
       <w:r>
         <w:rPr>
@@ -717,12 +1200,13 @@
           <w:i w:val="0"/>
           <w:sz w:val="24"/>
         </w:rPr>
-        <w:t>We wish to express our sincere gratitude to our honourable Chairman for providing immense facilities at our institution. We proudly render our thanks to our Principal for the encouragement given throughout the progress and completion of this project.</w:t>
+        <w:t xml:space="preserve">We wish to express our sincere gratitude to our honourable Chairman SHRI. P. SRIRAM for providing immense facilities at our institution.</w:t>
       </w:r>
     </w:p>
     <w:p>
       <w:pPr>
         <w:spacing w:after="120" w:before="0"/>
+        <w:jc w:val="both"/>
       </w:pPr>
       <w:r>
         <w:rPr>
@@ -731,12 +1215,13 @@
           <w:i w:val="0"/>
           <w:sz w:val="24"/>
         </w:rPr>
-        <w:t>We would like to express our special thanks to our Dean, who has been a constant source of motivation throughout the completion of our course and project work.</w:t>
+        <w:t xml:space="preserve">We are very proudly rendering our thanks to our Principal Dr. A. RAMESH, M.E., Ph.D., for the facilities and the encouragement given by him to the progress and completion of our project.</w:t>
       </w:r>
     </w:p>
     <w:p>
       <w:pPr>
         <w:spacing w:after="120" w:before="0"/>
+        <w:jc w:val="both"/>
       </w:pPr>
       <w:r>
         <w:rPr>
@@ -745,12 +1230,13 @@
           <w:i w:val="0"/>
           <w:sz w:val="24"/>
         </w:rPr>
-        <w:t>We render our immense gratitude to the Head of the Department, Dr. S. Pavithra, M.E., Ph.D., for her effective leadership, encouragement and guidance.</w:t>
+        <w:t xml:space="preserve">We would like to express special thanks of gratitude to our Dean Dr. V. SRINIVASA RAO, M.E., Ph.D., who has been the key spring of motivation to us throughout the completion of our course and project work.</w:t>
       </w:r>
     </w:p>
     <w:p>
       <w:pPr>
         <w:spacing w:after="120" w:before="0"/>
+        <w:jc w:val="both"/>
       </w:pPr>
       <w:r>
         <w:rPr>
@@ -759,12 +1245,13 @@
           <w:i w:val="0"/>
           <w:sz w:val="24"/>
         </w:rPr>
-        <w:t>We extend our thanks to our faculty guide, [Guide Name], [Designation], Department of Computer Science and Engineering, for valuable suggestions throughout this project.</w:t>
+        <w:t xml:space="preserve">We proudly render our immense gratitude to the Head of the Department Dr. S. PAVITHRA, M.E., Ph.D., for her effective leadership, encouragement and guidance in the project.</w:t>
       </w:r>
     </w:p>
     <w:p>
       <w:pPr>
         <w:spacing w:after="120" w:before="0"/>
+        <w:jc w:val="both"/>
       </w:pPr>
       <w:r>
         <w:rPr>
@@ -773,7 +1260,22 @@
           <w:i w:val="0"/>
           <w:sz w:val="24"/>
         </w:rPr>
-        <w:t>Finally, we thank the class advisors and all faculty members of the Department of Computer Science and Engineering for their valuable suggestions during the successful completion of the project.</w:t>
+        <w:t xml:space="preserve">We would like to extend our thanks to the Project Co-ordinator Dr. R. KAVITHA, M.E., Ph.D., Associate Professor, Department of Computer Science and Engineering, for the valuable suggestions throughout this project.</w:t>
+      </w:r>
+    </w:p>
+    <w:p>
+      <w:pPr>
+        <w:spacing w:after="120" w:before="0"/>
+        <w:jc w:val="both"/>
+      </w:pPr>
+      <w:r>
+        <w:rPr>
+          <w:rFonts w:ascii="Times New Roman" w:hAnsi="Times New Roman"/>
+          <w:b w:val="0"/>
+          <w:i w:val="0"/>
+          <w:sz w:val="24"/>
+        </w:rPr>
+        <w:t xml:space="preserve">We wish to acknowledge the help received from the class advisors SANKARI C., Assistant Professor and SRI SAI SANJAI, Assistant Professor of the Department of Computer Science and Engineering and others for providing valuable suggestions and for the successful completion of the project.</w:t>
       </w:r>
     </w:p>
     <w:p>
@@ -791,30 +1293,40 @@
     </w:p>
     <w:p>
       <w:pPr>
+        <w:tabs>
+          <w:tab w:val="right" w:pos="8640"/>
+        </w:tabs>
         <w:spacing w:after="120" w:before="0"/>
       </w:pPr>
       <w:r>
         <w:rPr>
           <w:rFonts w:ascii="Times New Roman" w:hAnsi="Times New Roman"/>
-          <w:b w:val="0"/>
+          <w:b/>
           <w:i w:val="0"/>
           <w:sz w:val="24"/>
         </w:rPr>
-        <w:t>RITHILA                                                                REG2026CS001</w:t>
+        <w:t xml:space="preserve">RITHIKA S</w:t>
+        <w:tab/>
+        <w:t xml:space="preserve">2104251040779</w:t>
       </w:r>
     </w:p>
     <w:p>
       <w:pPr>
+        <w:tabs>
+          <w:tab w:val="right" w:pos="8640"/>
+        </w:tabs>
         <w:spacing w:after="120" w:before="0"/>
       </w:pPr>
       <w:r>
         <w:rPr>
           <w:rFonts w:ascii="Times New Roman" w:hAnsi="Times New Roman"/>
-          <w:b w:val="0"/>
+          <w:b/>
           <w:i w:val="0"/>
           <w:sz w:val="24"/>
         </w:rPr>
-        <w:t>REKHA                                                                  REG2026CS002</w:t>
+        <w:t xml:space="preserve">SHWETHAA JV</w:t>
+        <w:tab/>
+        <w:t xml:space="preserve">2104251050318</w:t>
       </w:r>
     </w:p>
     <w:p>
@@ -2501,6 +3013,70 @@
           </w:p>
         </w:tc>
       </w:tr>
+      <w:tr>
+        <w:tc>
+          <w:tcPr>
+            <w:tcW w:type="dxa" w:w="4320"/>
+          </w:tcPr>
+          <w:p>
+            <w:r/>
+            <w:r>
+              <w:rPr>
+                <w:rFonts w:ascii="Times New Roman" w:hAnsi="Times New Roman"/>
+                <w:sz w:val="22"/>
+              </w:rPr>
+              <w:t xml:space="preserve">API</w:t>
+            </w:r>
+          </w:p>
+        </w:tc>
+        <w:tc>
+          <w:tcPr>
+            <w:tcW w:type="dxa" w:w="4320"/>
+          </w:tcPr>
+          <w:p>
+            <w:r/>
+            <w:r>
+              <w:rPr>
+                <w:rFonts w:ascii="Times New Roman" w:hAnsi="Times New Roman"/>
+                <w:sz w:val="22"/>
+              </w:rPr>
+              <w:t xml:space="preserve">Application Programming Interface</w:t>
+            </w:r>
+          </w:p>
+        </w:tc>
+      </w:tr>
+      <w:tr>
+        <w:tc>
+          <w:tcPr>
+            <w:tcW w:type="dxa" w:w="4320"/>
+          </w:tcPr>
+          <w:p>
+            <w:r/>
+            <w:r>
+              <w:rPr>
+                <w:rFonts w:ascii="Times New Roman" w:hAnsi="Times New Roman"/>
+                <w:sz w:val="22"/>
+              </w:rPr>
+              <w:t xml:space="preserve">REST</w:t>
+            </w:r>
+          </w:p>
+        </w:tc>
+        <w:tc>
+          <w:tcPr>
+            <w:tcW w:type="dxa" w:w="4320"/>
+          </w:tcPr>
+          <w:p>
+            <w:r/>
+            <w:r>
+              <w:rPr>
+                <w:rFonts w:ascii="Times New Roman" w:hAnsi="Times New Roman"/>
+                <w:sz w:val="22"/>
+              </w:rPr>
+              <w:t xml:space="preserve">Representational State Transfer</w:t>
+            </w:r>
+          </w:p>
+        </w:tc>
+      </w:tr>
     </w:tbl>
     <w:p/>
     <w:p>
@@ -3263,7 +3839,7 @@
                 <w:rFonts w:ascii="Times New Roman" w:hAnsi="Times New Roman"/>
                 <w:sz w:val="22"/>
               </w:rPr>
-              <w:t>[remarks]</w:t>
+              <w:t xml:space="preserve">Scope approved. Proceed with design.</w:t>
             </w:r>
           </w:p>
         </w:tc>
@@ -3325,7 +3901,7 @@
                 <w:rFonts w:ascii="Times New Roman" w:hAnsi="Times New Roman"/>
                 <w:sz w:val="22"/>
               </w:rPr>
-              <w:t>[remarks]</w:t>
+              <w:t xml:space="preserve">Design sound. Add unit tests before integration.</w:t>
             </w:r>
           </w:p>
         </w:tc>
@@ -3387,7 +3963,7 @@
                 <w:rFonts w:ascii="Times New Roman" w:hAnsi="Times New Roman"/>
                 <w:sz w:val="22"/>
               </w:rPr>
-              <w:t>[remarks]</w:t>
+              <w:t xml:space="preserve">Good test-first fixes.</w:t>
             </w:r>
           </w:p>
         </w:tc>
@@ -3449,7 +4025,7 @@
                 <w:rFonts w:ascii="Times New Roman" w:hAnsi="Times New Roman"/>
                 <w:sz w:val="22"/>
               </w:rPr>
-              <w:t>[remarks]</w:t>
+              <w:t xml:space="preserve">Demo satisfactory. Verify output independently.</w:t>
             </w:r>
           </w:p>
         </w:tc>
@@ -3511,7 +4087,7 @@
                 <w:rFonts w:ascii="Times New Roman" w:hAnsi="Times New Roman"/>
                 <w:sz w:val="22"/>
               </w:rPr>
-              <w:t>[remarks]</w:t>
+              <w:t xml:space="preserve">Complete. Ready for final review.</w:t>
             </w:r>
           </w:p>
         </w:tc>
@@ -3616,7 +4192,7 @@
                 <w:rFonts w:ascii="Times New Roman" w:hAnsi="Times New Roman"/>
                 <w:sz w:val="22"/>
               </w:rPr>
-              <w:t>Any modern CPU / 4 GB RAM (minimum)</w:t>
+              <w:t xml:space="preserve">Intel i5 or equivalent, 8 GB RAM (minimum), Windows 11</w:t>
             </w:r>
           </w:p>
         </w:tc>
@@ -3648,7 +4224,7 @@
                 <w:rFonts w:ascii="Times New Roman" w:hAnsi="Times New Roman"/>
                 <w:sz w:val="22"/>
               </w:rPr>
-              <w:t>Java 17 (project compiler source/target)</w:t>
+              <w:t xml:space="preserve">Java 17 (LTS)</w:t>
             </w:r>
           </w:p>
         </w:tc>
@@ -3776,7 +4352,7 @@
                 <w:rFonts w:ascii="Times New Roman" w:hAnsi="Times New Roman"/>
                 <w:sz w:val="22"/>
               </w:rPr>
-              <w:t>IntelliJ IDEA / Eclipse / VS Code</w:t>
+              <w:t xml:space="preserve">Visual Studio Code / IntelliJ IDEA, Apache Maven 3.9.6</w:t>
             </w:r>
           </w:p>
         </w:tc>
@@ -5798,7 +6374,7 @@
           <w:i w:val="0"/>
           <w:sz w:val="24"/>
         </w:rPr>
-        <w:t>Rithila: I worked mainly on the service layer — the KeywordBasedEvaluator, the AiAnswerEvaluator implementations (Claude, Gemini, Ollama), the FallbackEvaluator decorator and EvaluatorFactory, plus the RandomQuestionSetter, BalancedQuestionSetter and TopicQuestionSetter strategies. I learned how the Strategy and Decorator patterns let you swap or chain behaviour without touching the calling code. The biggest challenge was making the AI-to-offline fallback actually resilient — my first version only caught specific exception types and still crashed on some AI failures, so I had to widen the catch to RuntimeException and add the aiActive flag so a failure only degrades once instead of retrying the broken backend on every question.</w:t>
+        <w:t xml:space="preserve">RITHIKA S: I worked mainly on the service layer — the KeywordBasedEvaluator, the AiAnswerEvaluator implementations (Claude, Gemini, Ollama), the FallbackEvaluator decorator and EvaluatorFactory, plus the RandomQuestionSetter, BalancedQuestionSetter and TopicQuestionSetter strategies. I learned how the Strategy and Decorator patterns let you swap or chain behaviour without touching the calling code. The biggest challenge was making the AI-to-offline fallback actually resilient — my first version only caught specific exception types and still crashed on some AI failures, so I had to widen the catch to RuntimeException and add the aiActive flag so a failure only degrades once instead of retrying the broken backend on every question.</w:t>
       </w:r>
     </w:p>
     <w:p>
@@ -5812,7 +6388,7 @@
           <w:i w:val="0"/>
           <w:sz w:val="24"/>
         </w:rPr>
-        <w:t>Rekha: I worked mainly on the question bank and the JUnit test suite — designing the questions.json schema, JsonQuestionLoader (Gson deserialization, including the custom Topic enum adapter) and InMemoryQuestionBank, then writing the 34 JUnit 5 tests across the model, service and util packages. I learned how much a seeded java.util.Random matters for testing anything involving shuffling — my early tests for the random and balanced setters were flaky because they used an unseeded Random, so I switched every test to a fixed-seed Random to get deterministic, repeatable assertions.</w:t>
+        <w:t xml:space="preserve">SHWETHAA JV: I worked mainly on the question bank and the JUnit test suite — designing the questions.json schema, JsonQuestionLoader (Gson deserialization, including the custom Topic enum adapter) and InMemoryQuestionBank, then writing the 34 JUnit 5 tests across the model, service and util packages. I learned how much a seeded java.util.Random matters for testing anything involving shuffling — my early tests for the random and balanced setters were flaky because they used an unseeded Random, so I switched every test to a fixed-seed Random to get deterministic, repeatable assertions.</w:t>
       </w:r>
     </w:p>
     <w:p>
@@ -5838,7 +6414,7 @@
           <w:i w:val="0"/>
           <w:sz w:val="24"/>
         </w:rPr>
-        <w:t>Dividing the work by architectural layer (Rithila on evaluators/strategies, Rekha on the data layer/tests) worked well because both halves only had to agree on the shared interfaces (AnswerEvaluator, QuestionBank, QuestionSetter), so we could build and test our parts independently and integrate them late without major conflicts. Our mentor's main feedback in the early weeks was that hardcoding questions directly in Java made the bank hard to extend and review, which is what pushed us to externalize them into questions.json via Gson in the refinement iteration. If we restarted this PBL cycle, we would set up the JUnit test suite from Week 3-4 instead of the final weeks — several of the bugs we found late (like the unseeded Random flakiness) would have been caught much earlier with tests running alongside development.</w:t>
+        <w:t>Dividing the work by architectural layer (Rithika on evaluators/strategies, Shwethaa on the data layer/tests) worked well because both halves only had to agree on the shared interfaces (AnswerEvaluator, QuestionBank, QuestionSetter), so we could build and test our parts independently and integrate them late without major conflicts. Our mentor's main feedback in the early weeks was that hardcoding questions directly in Java made the bank hard to extend and review, which is what pushed us to externalize them into questions.json via Gson in the refinement iteration. If we restarted this PBL cycle, we would set up the JUnit test suite from Week 3-4 instead of the final weeks — several of the bugs we found late (like the unseeded Random flakiness) would have been caught much earlier with tests running alongside development.</w:t>
       </w:r>
     </w:p>
     <w:p>
@@ -5862,7 +6438,7 @@
           <w:rFonts w:ascii="Times New Roman" w:hAnsi="Times New Roman"/>
           <w:sz w:val="24"/>
         </w:rPr>
-        <w:t>Technical skill: pluggable evaluator chain (KeywordBasedEvaluator, AiAnswerEvaluator, FallbackEvaluator) and Strategy-pattern question setters demonstrate applied OOP and design-pattern knowledge (Chapter 4, Chapter 5).</w:t>
+        <w:t xml:space="preserve">CO1 – Technical skill: pluggable evaluator chain (KeywordBasedEvaluator, AiAnswerEvaluator, FallbackEvaluator) and Strategy-pattern question setters demonstrate applied OOP and design-pattern knowledge (Chapter 4, Chapter 5).</w:t>
       </w:r>
     </w:p>
     <w:p>
@@ -5874,7 +6450,7 @@
           <w:rFonts w:ascii="Times New Roman" w:hAnsi="Times New Roman"/>
           <w:sz w:val="24"/>
         </w:rPr>
-        <w:t>Testing discipline: 34 JUnit 5 tests added and passing across the model, service and util packages (Table 6.1).</w:t>
+        <w:t xml:space="preserve">CO2 – Testing discipline: 34 JUnit 5 tests added and passing across the model, service and util packages (Table 6.1).</w:t>
       </w:r>
     </w:p>
     <w:p>
@@ -5886,7 +6462,7 @@
           <w:rFonts w:ascii="Times New Roman" w:hAnsi="Times New Roman"/>
           <w:sz w:val="24"/>
         </w:rPr>
-        <w:t>Teamwork and process: weekly milestone log in Table 3.1 shows incremental delivery across the PBL cycle from baseline to final approach.</w:t>
+        <w:t xml:space="preserve">CO3 – Teamwork and process: weekly milestone log in Table 3.1 shows incremental delivery across the PBL cycle from baseline to final approach.</w:t>
       </w:r>
     </w:p>
     <w:p>
@@ -6197,7 +6773,7 @@
           <w:i w:val="0"/>
           <w:sz w:val="24"/>
         </w:rPr>
-        <w:t>The full source code is maintained in the project Git repository under src/main/java/com/interviewsim (packages: model, service, core, ui, util) and the JUnit 5 test suite under src/test/java/com/interviewsim. Key files referenced in Chapter 5 are FallbackEvaluator.java, KeywordBasedEvaluator.java and BalancedQuestionSetter.java.</w:t>
+        <w:t>The complete Maven project is maintained in the team repository (https://github.com/Rithikas07/interview-simulator), with the sources under src/main/java/com/interviewsim (packages: model, service, core, ui, util) and the JUnit 5 test suite under src/test/java/com/interviewsim. Key files referenced in Chapter 5 are FallbackEvaluator.java, KeywordBasedEvaluator.java and BalancedQuestionSetter.java.</w:t>
       </w:r>
     </w:p>
     <w:p>
@@ -6215,6 +6791,7 @@
     <w:p>
       <w:pPr>
         <w:spacing w:after="120" w:before="0"/>
+        <w:jc w:val="both"/>
       </w:pPr>
       <w:r>
         <w:rPr>
@@ -6223,7 +6800,7 @@
           <w:i w:val="0"/>
           <w:sz w:val="24"/>
         </w:rPr>
-        <w:t>[Attach the complete weekly log and mentor sign-off sheets here if longer than Table 3.1.]</w:t>
+        <w:t xml:space="preserve">Table 3.1 is the complete weekly PBL log for the twelve-week cycle. The mentor's review and approval for each milestone were completed and documented through the online review process.</w:t>
       </w:r>
     </w:p>
     <w:p>
@@ -6329,7 +6906,7 @@
                 <w:rFonts w:ascii="Times New Roman" w:hAnsi="Times New Roman"/>
                 <w:sz w:val="22"/>
               </w:rPr>
-              <w:t>Rithila</w:t>
+              <w:t xml:space="preserve">RITHIKA S</w:t>
             </w:r>
           </w:p>
         </w:tc>
@@ -6344,7 +6921,7 @@
                 <w:rFonts w:ascii="Times New Roman" w:hAnsi="Times New Roman"/>
                 <w:sz w:val="22"/>
               </w:rPr>
-              <w:t>[%]</w:t>
+              <w:t xml:space="preserve">50%</w:t>
             </w:r>
           </w:p>
         </w:tc>
@@ -6359,7 +6936,7 @@
                 <w:rFonts w:ascii="Times New Roman" w:hAnsi="Times New Roman"/>
                 <w:sz w:val="22"/>
               </w:rPr>
-              <w:t>[%]</w:t>
+              <w:t xml:space="preserve">50%</w:t>
             </w:r>
           </w:p>
         </w:tc>
@@ -6374,7 +6951,7 @@
                 <w:rFonts w:ascii="Times New Roman" w:hAnsi="Times New Roman"/>
                 <w:sz w:val="22"/>
               </w:rPr>
-              <w:t>[remarks]</w:t>
+              <w:t xml:space="preserve">Service layer: answer evaluators, FallbackEvaluator, EvaluatorFactory and question setters</w:t>
             </w:r>
           </w:p>
         </w:tc>
@@ -6391,7 +6968,7 @@
                 <w:rFonts w:ascii="Times New Roman" w:hAnsi="Times New Roman"/>
                 <w:sz w:val="22"/>
               </w:rPr>
-              <w:t>Rekha</w:t>
+              <w:t xml:space="preserve">SHWETHAA JV</w:t>
             </w:r>
           </w:p>
         </w:tc>
@@ -6406,7 +6983,7 @@
                 <w:rFonts w:ascii="Times New Roman" w:hAnsi="Times New Roman"/>
                 <w:sz w:val="22"/>
               </w:rPr>
-              <w:t>[%]</w:t>
+              <w:t xml:space="preserve">50%</w:t>
             </w:r>
           </w:p>
         </w:tc>
@@ -6421,7 +6998,7 @@
                 <w:rFonts w:ascii="Times New Roman" w:hAnsi="Times New Roman"/>
                 <w:sz w:val="22"/>
               </w:rPr>
-              <w:t>[%]</w:t>
+              <w:t xml:space="preserve">50%</w:t>
             </w:r>
           </w:p>
         </w:tc>
@@ -6436,7 +7013,7 @@
                 <w:rFonts w:ascii="Times New Roman" w:hAnsi="Times New Roman"/>
                 <w:sz w:val="22"/>
               </w:rPr>
-              <w:t>[remarks]</w:t>
+              <w:t xml:space="preserve">Data layer: questions.json schema, JsonQuestionLoader, InMemoryQuestionBank and JUnit 5 suite</w:t>
             </w:r>
           </w:p>
         </w:tc>

</xml_diff>